<commit_message>
fix: correct inspector_num/date rows in template and code
- Template: blank invisible {{date}} that was leaking into header area
- Template: rename {{date}} in inspector_num row to {{inspector_num}}
- Template: insert missing תאריך row with {{date}} before שעה row
- report.js: revert patch swap — inspector_num->inspNum, date->dateHe

Co-Authored-By: Claude Sonnet 4.6 <noreply@anthropic.com>
</commit_message>
<xml_diff>
--- a/YNSHOUF_Template.docx
+++ b/YNSHOUF_Template.docx
@@ -31,8 +31,6 @@
           <w:lang w:bidi="he-IL"/>
         </w:rPr>
       </w:pPr>
-      <w:bookmarkStart w:id="0" w:name="_GoBack"/>
-      <w:bookmarkEnd w:id="0"/>
       <w:r>
         <w:rPr>
           <w:rFonts w:ascii="var(--font-mono)" w:eastAsia="Times New Roman" w:hAnsi="var(--font-mono)" w:cs="Courier New"/>
@@ -41,7 +39,7 @@
           <w:szCs w:val="20"/>
           <w:lang w:bidi="he-IL"/>
         </w:rPr>
-        <w:t>{{date}}</w:t>
+        <w:t/>
       </w:r>
     </w:p>
     <w:p>
@@ -92,6 +90,7 @@
           <w:rFonts w:asciiTheme="minorBidi" w:hAnsiTheme="minorBidi" w:cs="Arial"/>
           <w:b w:val="0"/>
           <w:bCs w:val="0"/>
+          <w:color w:val="548DD4" w:themeColor="text2" w:themeTint="99"/>
           <w:sz w:val="28"/>
           <w:szCs w:val="28"/>
           <w:rtl/>
@@ -143,7 +142,7 @@
           <w:rFonts w:asciiTheme="minorBidi" w:hAnsiTheme="minorBidi" w:cs="Arial"/>
           <w:b w:val="0"/>
           <w:bCs w:val="0"/>
-          <w:color w:val="2E74B5"/>
+          <w:color w:val="548DD4" w:themeColor="text2" w:themeTint="99"/>
           <w:sz w:val="28"/>
           <w:szCs w:val="28"/>
           <w:rtl/>
@@ -157,7 +156,7 @@
           <w:rFonts w:asciiTheme="minorBidi" w:hAnsiTheme="minorBidi" w:cs="Arial"/>
           <w:b w:val="0"/>
           <w:bCs w:val="0"/>
-          <w:color w:val="2E74B5"/>
+          <w:color w:val="548DD4" w:themeColor="text2" w:themeTint="99"/>
           <w:sz w:val="28"/>
           <w:szCs w:val="28"/>
           <w:lang w:bidi="he-IL"/>
@@ -170,7 +169,7 @@
           <w:rFonts w:asciiTheme="minorBidi" w:hAnsiTheme="minorBidi" w:cs="Arial"/>
           <w:b w:val="0"/>
           <w:bCs w:val="0"/>
-          <w:color w:val="2E74B5"/>
+          <w:color w:val="548DD4" w:themeColor="text2" w:themeTint="99"/>
           <w:sz w:val="28"/>
           <w:szCs w:val="28"/>
           <w:rtl/>
@@ -185,7 +184,7 @@
         <w:bidi/>
         <w:spacing w:before="500" w:after="50"/>
         <w:rPr>
-          <w:rtl w:val="0"/>
+          <w:rFonts w:hint="cs"/>
         </w:rPr>
       </w:pPr>
       <w:r>
@@ -246,6 +245,8 @@
         </w:rPr>
         <w:t>:</w:t>
       </w:r>
+      <w:bookmarkStart w:id="0" w:name="_GoBack"/>
+      <w:bookmarkEnd w:id="0"/>
     </w:p>
     <w:p>
       <w:pPr>
@@ -339,59 +340,6 @@
         <w:gridCol w:w="4505"/>
         <w:gridCol w:w="4505"/>
       </w:tblGrid>
-      <w:tr>
-        <w:trPr>
-          <w:cantSplit/>
-        </w:trPr>
-        <w:tc>
-          <w:tcPr>
-            <w:tcW w:w="4505" w:type="dxa"/>
-            <w:tcBorders>
-              <w:top w:val="single" w:sz="1" w:space="0" w:color="CCCCCC"/>
-              <w:left w:val="single" w:sz="1" w:space="0" w:color="CCCCCC"/>
-              <w:bottom w:val="single" w:sz="1" w:space="0" w:color="CCCCCC"/>
-              <w:right w:val="single" w:sz="1" w:space="0" w:color="CCCCCC"/>
-            </w:tcBorders>
-            <w:tcMar>
-              <w:top w:w="100" w:type="dxa"/>
-              <w:left w:w="100" w:type="dxa"/>
-              <w:bottom w:w="100" w:type="dxa"/>
-              <w:right w:w="100" w:type="dxa"/>
-            </w:tcMar>
-            <w:vAlign w:val="center"/>
-          </w:tcPr>
-          <w:p>
-            <w:pPr>
-              <w:pStyle w:val="TiMiNormal"/>
-              <w:bidi/>
-            </w:pPr>
-            <w:r>
-              <w:t>מספר דוח</w:t>
-            </w:r>
-          </w:p>
-        </w:tc>
-        <w:tc>
-          <w:tcPr>
-            <w:tcW w:w="4505" w:type="dxa"/>
-            <w:tcBorders>
-              <w:top w:val="single" w:sz="1" w:space="0" w:color="CCCCCC"/>
-              <w:left w:val="single" w:sz="1" w:space="0" w:color="CCCCCC"/>
-              <w:bottom w:val="single" w:sz="1" w:space="0" w:color="CCCCCC"/>
-              <w:right w:val="single" w:sz="1" w:space="0" w:color="CCCCCC"/>
-            </w:tcBorders>
-            <w:vAlign w:val="center"/>
-          </w:tcPr>
-          <w:p>
-            <w:pPr>
-              <w:pStyle w:val="TiMiNormal"/>
-              <w:bidi/>
-            </w:pPr>
-            <w:r>
-              <w:t>{{report_id}}</w:t>
-            </w:r>
-          </w:p>
-        </w:tc>
-      </w:tr>
       <w:tr>
         <w:trPr>
           <w:cantSplit/>
@@ -472,7 +420,10 @@
               <w:bidi/>
             </w:pPr>
             <w:r>
-              <w:t>מספר פקח</w:t>
+              <w:rPr>
+                <w:rFonts w:hint="cs"/>
+              </w:rPr>
+              <w:t>תאריך</w:t>
             </w:r>
           </w:p>
         </w:tc>
@@ -525,7 +476,10 @@
               <w:bidi/>
             </w:pPr>
             <w:r>
-              <w:t>מספר פקח</w:t>
+              <w:rPr>
+                <w:rFonts w:hint="cs"/>
+              </w:rPr>
+              <w:t>תאריך</w:t>
             </w:r>
           </w:p>
         </w:tc>
@@ -909,6 +863,7 @@
         <w:rPr>
           <w:rFonts w:hint="cs"/>
         </w:rPr>
+        <w:lastRenderedPageBreak/>
         <w:t>טבלת</w:t>
       </w:r>
       <w:r>
@@ -1623,6 +1578,13 @@
         <w:bidi/>
         <w:spacing w:before="500" w:after="50"/>
       </w:pPr>
+    </w:p>
+    <w:p>
+      <w:pPr>
+        <w:pStyle w:val="TiMiHeading1"/>
+        <w:bidi/>
+        <w:spacing w:before="500" w:after="50"/>
+      </w:pPr>
       <w:r>
         <w:rPr>
           <w:rFonts w:hint="cs"/>
@@ -1654,21 +1616,13 @@
     </w:p>
     <w:p>
       <w:pPr>
-        <w:pStyle w:val="TiMiHeading1"/>
-        <w:jc w:val="right"/>
-      </w:pPr>
-      <w:r>
-        <w:t>חתימה ואישור</w:t>
-      </w:r>
-    </w:p>
-    <w:p>
-      <w:pPr>
         <w:pStyle w:val="TiMiNormal"/>
         <w:jc w:val="right"/>
-      </w:pPr>
-      <w:r>
-        <w:t>{{signature}}</w:t>
-      </w:r>
+        <w:rPr>
+          <w:rFonts w:hint="cs"/>
+          <w:rtl w:val="0"/>
+        </w:rPr>
+      </w:pPr>
     </w:p>
     <w:sectPr>
       <w:headerReference w:type="default" r:id="rId10"/>
@@ -1719,18 +1673,158 @@
         <w:lang w:bidi="he-IL"/>
       </w:rPr>
     </w:pPr>
-    <w:proofErr w:type="spellStart"/>
-    <w:proofErr w:type="spellEnd"/>
-    <w:proofErr w:type="gramStart"/>
-    <w:proofErr w:type="gramEnd"/>
-    <w:proofErr w:type="spellStart"/>
-    <w:proofErr w:type="spellEnd"/>
     <w:r>
       <w:rPr>
         <w:rFonts w:ascii="Arial" w:hAnsi="Arial"/>
         <w:sz w:val="20"/>
       </w:rPr>
-      <w:t>YNSHOUF_NAME , מספר עובד YNSHOUF_NUM, פקח נגב מערבי, ינשוו"פ, רט"ג</w:t>
+      <w:t xml:space="preserve">YNSHOUF_NAME , </w:t>
+    </w:r>
+    <w:r>
+      <w:rPr>
+        <w:rFonts w:ascii="Arial" w:hAnsi="Arial" w:cs="Arial"/>
+        <w:sz w:val="20"/>
+        <w:szCs w:val="20"/>
+        <w:rtl/>
+        <w:lang w:bidi="he-IL"/>
+      </w:rPr>
+      <w:t>מספר</w:t>
+    </w:r>
+    <w:r>
+      <w:rPr>
+        <w:rFonts w:ascii="Arial" w:hAnsi="Arial"/>
+        <w:sz w:val="20"/>
+      </w:rPr>
+      <w:t xml:space="preserve"> </w:t>
+    </w:r>
+    <w:r>
+      <w:rPr>
+        <w:rFonts w:ascii="Arial" w:hAnsi="Arial" w:cs="Arial"/>
+        <w:sz w:val="20"/>
+        <w:szCs w:val="20"/>
+        <w:rtl/>
+        <w:lang w:bidi="he-IL"/>
+      </w:rPr>
+      <w:t>עובד</w:t>
+    </w:r>
+    <w:r>
+      <w:rPr>
+        <w:rFonts w:ascii="Arial" w:hAnsi="Arial"/>
+        <w:sz w:val="20"/>
+      </w:rPr>
+      <w:t xml:space="preserve"> YNSHOUF_NUM, </w:t>
+    </w:r>
+    <w:r>
+      <w:rPr>
+        <w:rFonts w:ascii="Arial" w:hAnsi="Arial" w:cs="Arial"/>
+        <w:sz w:val="20"/>
+        <w:szCs w:val="20"/>
+        <w:rtl/>
+        <w:lang w:bidi="he-IL"/>
+      </w:rPr>
+      <w:t>פקח</w:t>
+    </w:r>
+    <w:r>
+      <w:rPr>
+        <w:rFonts w:ascii="Arial" w:hAnsi="Arial"/>
+        <w:sz w:val="20"/>
+      </w:rPr>
+      <w:t xml:space="preserve"> </w:t>
+    </w:r>
+    <w:r>
+      <w:rPr>
+        <w:rFonts w:ascii="Arial" w:hAnsi="Arial" w:cs="Arial"/>
+        <w:sz w:val="20"/>
+        <w:szCs w:val="20"/>
+        <w:rtl/>
+        <w:lang w:bidi="he-IL"/>
+      </w:rPr>
+      <w:t>נגב</w:t>
+    </w:r>
+    <w:r>
+      <w:rPr>
+        <w:rFonts w:ascii="Arial" w:hAnsi="Arial"/>
+        <w:sz w:val="20"/>
+      </w:rPr>
+      <w:t xml:space="preserve"> </w:t>
+    </w:r>
+    <w:r>
+      <w:rPr>
+        <w:rFonts w:ascii="Arial" w:hAnsi="Arial" w:cs="Arial"/>
+        <w:sz w:val="20"/>
+        <w:szCs w:val="20"/>
+        <w:rtl/>
+        <w:lang w:bidi="he-IL"/>
+      </w:rPr>
+      <w:t>מערבי</w:t>
+    </w:r>
+    <w:r>
+      <w:rPr>
+        <w:rFonts w:ascii="Arial" w:hAnsi="Arial"/>
+        <w:sz w:val="20"/>
+      </w:rPr>
+      <w:t xml:space="preserve">, </w:t>
+    </w:r>
+    <w:r>
+      <w:rPr>
+        <w:rFonts w:ascii="Arial" w:hAnsi="Arial" w:cs="Arial"/>
+        <w:sz w:val="20"/>
+        <w:szCs w:val="20"/>
+        <w:rtl/>
+        <w:lang w:bidi="he-IL"/>
+      </w:rPr>
+      <w:t>ינשוו</w:t>
+    </w:r>
+    <w:r>
+      <w:rPr>
+        <w:rFonts w:ascii="Arial" w:hAnsi="Arial"/>
+        <w:sz w:val="20"/>
+      </w:rPr>
+      <w:t>"</w:t>
+    </w:r>
+    <w:r>
+      <w:rPr>
+        <w:rFonts w:ascii="Arial" w:hAnsi="Arial" w:cs="Arial"/>
+        <w:sz w:val="20"/>
+        <w:szCs w:val="20"/>
+        <w:rtl/>
+        <w:lang w:bidi="he-IL"/>
+      </w:rPr>
+      <w:t>פ</w:t>
+    </w:r>
+    <w:r>
+      <w:rPr>
+        <w:rFonts w:ascii="Arial" w:hAnsi="Arial"/>
+        <w:sz w:val="20"/>
+      </w:rPr>
+      <w:t xml:space="preserve">, </w:t>
+    </w:r>
+    <w:r>
+      <w:rPr>
+        <w:rFonts w:ascii="Arial" w:hAnsi="Arial" w:cs="Arial"/>
+        <w:sz w:val="20"/>
+        <w:szCs w:val="20"/>
+        <w:rtl/>
+        <w:lang w:bidi="he-IL"/>
+      </w:rPr>
+      <w:t>רט</w:t>
+    </w:r>
+    <w:r>
+      <w:rPr>
+        <w:rFonts w:ascii="Arial" w:hAnsi="Arial"/>
+        <w:sz w:val="20"/>
+      </w:rPr>
+      <w:t>"</w:t>
+    </w:r>
+    <w:r>
+      <w:rPr>
+        <w:rFonts w:ascii="Arial" w:hAnsi="Arial" w:cs="Arial"/>
+        <w:sz w:val="20"/>
+        <w:szCs w:val="20"/>
+        <w:rtl/>
+        <w:lang w:bidi="he-IL"/>
+      </w:rPr>
+      <w:t>ג</w:t>
     </w:r>
   </w:p>
 </w:ftr>
@@ -6266,7 +6360,7 @@
 </file>
 
 <file path=customXml/itemProps2.xml><?xml version="1.0" encoding="utf-8"?>
-<ds:datastoreItem xmlns:ds="http://schemas.openxmlformats.org/officeDocument/2006/customXml" ds:itemID="{79DE6DD6-F1D1-44F9-AF4B-93414D07F7A6}">
+<ds:datastoreItem xmlns:ds="http://schemas.openxmlformats.org/officeDocument/2006/customXml" ds:itemID="{F29FE05D-982E-42FB-AA25-B115710D0118}">
   <ds:schemaRefs>
     <ds:schemaRef ds:uri="http://schemas.openxmlformats.org/officeDocument/2006/bibliography"/>
   </ds:schemaRefs>

</xml_diff>

<commit_message>
fix: move {{date}} into table date row, remove stray out-of-table occurrence
Co-Authored-By: Claude Sonnet 4.6 <noreply@anthropic.com>
</commit_message>
<xml_diff>
--- a/YNSHOUF_Template.docx
+++ b/YNSHOUF_Template.docx
@@ -4,42 +4,66 @@
   <w:body>
     <w:p>
       <w:pPr>
-        <w:tabs>
-          <w:tab w:val="left" w:pos="916"/>
-          <w:tab w:val="left" w:pos="1832"/>
-          <w:tab w:val="left" w:pos="2748"/>
-          <w:tab w:val="left" w:pos="3664"/>
-          <w:tab w:val="left" w:pos="4580"/>
-          <w:tab w:val="left" w:pos="5496"/>
-          <w:tab w:val="left" w:pos="6412"/>
-          <w:tab w:val="left" w:pos="7328"/>
-          <w:tab w:val="left" w:pos="8244"/>
-          <w:tab w:val="left" w:pos="9160"/>
-          <w:tab w:val="left" w:pos="10076"/>
-          <w:tab w:val="left" w:pos="10992"/>
-          <w:tab w:val="left" w:pos="11908"/>
-          <w:tab w:val="left" w:pos="12824"/>
-          <w:tab w:val="left" w:pos="13740"/>
-          <w:tab w:val="left" w:pos="14656"/>
-        </w:tabs>
-        <w:spacing w:after="0"/>
+        <w:pStyle w:val="Title"/>
+        <w:bidi/>
+        <w:spacing w:before="0"/>
+        <w:jc w:val="right"/>
         <w:rPr>
-          <w:rFonts w:ascii="var(--font-mono)" w:eastAsia="Times New Roman" w:hAnsi="var(--font-mono)" w:cs="Courier New"/>
-          <w:color w:val="EAECF0"/>
-          <w:sz w:val="20"/>
-          <w:szCs w:val="20"/>
+          <w:rFonts w:asciiTheme="minorBidi" w:hAnsiTheme="minorBidi" w:cstheme="minorBidi" w:hint="cs"/>
+          <w:color w:val="auto"/>
+          <w:sz w:val="24"/>
+          <w:szCs w:val="24"/>
+          <w:u w:val="single"/>
+          <w:rtl/>
           <w:lang w:bidi="he-IL"/>
         </w:rPr>
       </w:pPr>
       <w:r>
         <w:rPr>
-          <w:rFonts w:ascii="var(--font-mono)" w:eastAsia="Times New Roman" w:hAnsi="var(--font-mono)" w:cs="Courier New"/>
-          <w:color w:val="EAECF0"/>
-          <w:sz w:val="20"/>
-          <w:szCs w:val="20"/>
+          <w:rFonts w:asciiTheme="minorBidi" w:hAnsiTheme="minorBidi" w:cs="Arial"/>
+          <w:color w:val="auto"/>
+          <w:sz w:val="24"/>
+          <w:szCs w:val="24"/>
+          <w:u w:val="single"/>
+          <w:rtl/>
           <w:lang w:bidi="he-IL"/>
         </w:rPr>
         <w:t/>
+      </w:r>
+      <w:r>
+        <w:rPr>
+          <w:rFonts w:asciiTheme="minorBidi" w:hAnsiTheme="minorBidi" w:cstheme="minorBidi"/>
+          <w:color w:val="auto"/>
+          <w:sz w:val="24"/>
+          <w:szCs w:val="24"/>
+          <w:u w:val="single"/>
+          <w:lang w:bidi="he-IL"/>
+        </w:rPr>
+        <w:t>date</w:t>
+      </w:r>
+      <w:r>
+        <w:rPr>
+          <w:rFonts w:asciiTheme="minorBidi" w:hAnsiTheme="minorBidi" w:cs="Arial"/>
+          <w:color w:val="auto"/>
+          <w:sz w:val="24"/>
+          <w:szCs w:val="24"/>
+          <w:u w:val="single"/>
+          <w:rtl/>
+          <w:lang w:bidi="he-IL"/>
+        </w:rPr>
+        <w:t/>
+      </w:r>
+      <w:r>
+        <w:rPr>
+          <w:rFonts w:asciiTheme="minorBidi" w:hAnsiTheme="minorBidi" w:cstheme="minorBidi" w:hint="cs"/>
+          <w:color w:val="auto"/>
+          <w:sz w:val="24"/>
+          <w:szCs w:val="24"/>
+          <w:u w:val="single"/>
+          <w:rtl/>
+          <w:lang w:bidi="he-IL"/>
+        </w:rPr>
+        <w:t xml:space="preserve">                                                          </w:t>
       </w:r>
     </w:p>
     <w:p>
@@ -67,6 +91,18 @@
           <w:lang w:bidi="he-IL"/>
         </w:rPr>
         <w:t>דוח פעולה</w:t>
+      </w:r>
+      <w:r>
+        <w:rPr>
+          <w:rFonts w:asciiTheme="minorBidi" w:hAnsiTheme="minorBidi" w:cstheme="minorBidi" w:hint="cs"/>
+          <w:color w:val="auto"/>
+          <w:sz w:val="24"/>
+          <w:szCs w:val="24"/>
+          <w:u w:val="single"/>
+          <w:rtl/>
+          <w:lang w:bidi="he-IL"/>
+        </w:rPr>
+        <w:t xml:space="preserve">                                                    </w:t>
       </w:r>
       <w:r>
         <w:rPr>
@@ -183,9 +219,6 @@
         <w:pStyle w:val="TiMiHeading1"/>
         <w:bidi/>
         <w:spacing w:before="500" w:after="50"/>
-        <w:rPr>
-          <w:rFonts w:hint="cs"/>
-        </w:rPr>
       </w:pPr>
       <w:r>
         <w:rPr>
@@ -199,7 +232,7 @@
         <w:bidi/>
         <w:spacing w:before="100" w:beforeAutospacing="1" w:after="100" w:afterAutospacing="1" w:line="360" w:lineRule="auto"/>
         <w:rPr>
-          <w:rFonts w:asciiTheme="minorBidi" w:eastAsia="Times New Roman" w:hAnsiTheme="minorBidi"/>
+          <w:rFonts w:asciiTheme="minorBidi" w:eastAsia="Times New Roman" w:hAnsiTheme="minorBidi" w:hint="cs"/>
           <w:color w:val="1F497D" w:themeColor="text2"/>
           <w:rtl/>
           <w:lang w:bidi="he-IL"/>
@@ -418,6 +451,65 @@
             <w:pPr>
               <w:pStyle w:val="TiMiNormal"/>
               <w:bidi/>
+              <w:rPr>
+                <w:rFonts w:hint="cs"/>
+              </w:rPr>
+            </w:pPr>
+            <w:r>
+              <w:rPr>
+                <w:rFonts w:hint="cs"/>
+              </w:rPr>
+              <w:t>מספר פקח</w:t>
+            </w:r>
+          </w:p>
+        </w:tc>
+        <w:tc>
+          <w:tcPr>
+            <w:tcW w:w="4505" w:type="dxa"/>
+            <w:tcBorders>
+              <w:top w:val="single" w:sz="1" w:space="0" w:color="CCCCCC"/>
+              <w:left w:val="single" w:sz="1" w:space="0" w:color="CCCCCC"/>
+              <w:bottom w:val="single" w:sz="1" w:space="0" w:color="CCCCCC"/>
+              <w:right w:val="single" w:sz="1" w:space="0" w:color="CCCCCC"/>
+            </w:tcBorders>
+            <w:vAlign w:val="center"/>
+          </w:tcPr>
+          <w:p>
+            <w:pPr>
+              <w:pStyle w:val="TiMiNormal"/>
+              <w:bidi/>
+            </w:pPr>
+            <w:r>
+              <w:t>{{inspector_num}}</w:t>
+            </w:r>
+          </w:p>
+        </w:tc>
+      </w:tr>
+      <w:tr>
+        <w:trPr>
+          <w:cantSplit/>
+        </w:trPr>
+        <w:tc>
+          <w:tcPr>
+            <w:tcW w:w="4505" w:type="dxa"/>
+            <w:tcBorders>
+              <w:top w:val="single" w:sz="1" w:space="0" w:color="CCCCCC"/>
+              <w:left w:val="single" w:sz="1" w:space="0" w:color="CCCCCC"/>
+              <w:bottom w:val="single" w:sz="1" w:space="0" w:color="CCCCCC"/>
+              <w:right w:val="single" w:sz="1" w:space="0" w:color="CCCCCC"/>
+            </w:tcBorders>
+            <w:tcMar>
+              <w:top w:w="100" w:type="dxa"/>
+              <w:left w:w="100" w:type="dxa"/>
+              <w:bottom w:w="100" w:type="dxa"/>
+              <w:right w:w="100" w:type="dxa"/>
+            </w:tcMar>
+            <w:vAlign w:val="center"/>
+          </w:tcPr>
+          <w:p>
+            <w:pPr>
+              <w:pStyle w:val="TiMiNormal"/>
+              <w:bidi/>
             </w:pPr>
             <w:r>
               <w:rPr>
@@ -444,7 +536,7 @@
               <w:bidi/>
             </w:pPr>
             <w:r>
-              <w:t>{{inspector_num}}</w:t>
+              <w:t/>
             </w:r>
           </w:p>
         </w:tc>
@@ -863,7 +955,6 @@
         <w:rPr>
           <w:rFonts w:hint="cs"/>
         </w:rPr>
-        <w:lastRenderedPageBreak/>
         <w:t>טבלת</w:t>
       </w:r>
       <w:r>
@@ -1589,7 +1680,6 @@
         <w:rPr>
           <w:rFonts w:hint="cs"/>
         </w:rPr>
-        <w:lastRenderedPageBreak/>
         <w:t>תמונות:</w:t>
       </w:r>
     </w:p>
@@ -1619,7 +1709,6 @@
         <w:pStyle w:val="TiMiNormal"/>
         <w:jc w:val="right"/>
         <w:rPr>
-          <w:rFonts w:hint="cs"/>
           <w:rtl w:val="0"/>
         </w:rPr>
       </w:pPr>
@@ -2109,7 +2198,7 @@
                   </wp:anchor>
                 </w:drawing>
               </mc:Choice>
-              <mc:Fallback xmlns:oel="http://schemas.microsoft.com/office/2019/extlst" xmlns:w16du="http://schemas.microsoft.com/office/word/2023/wordml/word16du" xmlns:w16sdtfl="http://schemas.microsoft.com/office/word/2024/wordml/sdtformatlock" xmlns:w16se="http://schemas.microsoft.com/office/word/2015/wordml/symex" xmlns:w16sdtdh="http://schemas.microsoft.com/office/word/2020/wordml/sdtdatahash" xmlns:w16="http://schemas.microsoft.com/office/word/2018/wordml" xmlns:w16cid="http://schemas.microsoft.com/office/word/2016/wordml/cid" xmlns:w16cex="http://schemas.microsoft.com/office/word/2018/wordml/cex" xmlns:w15="http://schemas.microsoft.com/office/word/2012/wordml" xmlns:am3d="http://schemas.microsoft.com/office/drawing/2017/model3d" xmlns:aink="http://schemas.microsoft.com/office/drawing/2016/ink" xmlns:cx8="http://schemas.microsoft.com/office/drawing/2016/5/14/chartex" xmlns:cx7="http://schemas.microsoft.com/office/drawing/2016/5/13/chartex" xmlns:cx6="http://schemas.microsoft.com/office/drawing/2016/5/12/chartex" xmlns:cx5="http://schemas.microsoft.com/office/drawing/2016/5/11/chartex" xmlns:cx4="http://schemas.microsoft.com/office/drawing/2016/5/10/chartex" xmlns:cx3="http://schemas.microsoft.com/office/drawing/2016/5/9/chartex" xmlns:cx2="http://schemas.microsoft.com/office/drawing/2015/10/21/chartex" xmlns:cx1="http://schemas.microsoft.com/office/drawing/2015/9/8/chartex" xmlns:cx="http://schemas.microsoft.com/office/drawing/2014/chartex">
+              <mc:Fallback xmlns:cx="http://schemas.microsoft.com/office/drawing/2014/chartex" xmlns:cx1="http://schemas.microsoft.com/office/drawing/2015/9/8/chartex" xmlns:cx2="http://schemas.microsoft.com/office/drawing/2015/10/21/chartex" xmlns:cx3="http://schemas.microsoft.com/office/drawing/2016/5/9/chartex" xmlns:cx4="http://schemas.microsoft.com/office/drawing/2016/5/10/chartex" xmlns:cx5="http://schemas.microsoft.com/office/drawing/2016/5/11/chartex" xmlns:cx6="http://schemas.microsoft.com/office/drawing/2016/5/12/chartex" xmlns:cx7="http://schemas.microsoft.com/office/drawing/2016/5/13/chartex" xmlns:cx8="http://schemas.microsoft.com/office/drawing/2016/5/14/chartex" xmlns:aink="http://schemas.microsoft.com/office/drawing/2016/ink" xmlns:am3d="http://schemas.microsoft.com/office/drawing/2017/model3d" xmlns:w15="http://schemas.microsoft.com/office/word/2012/wordml" xmlns:w16cex="http://schemas.microsoft.com/office/word/2018/wordml/cex" xmlns:w16cid="http://schemas.microsoft.com/office/word/2016/wordml/cid" xmlns:w16="http://schemas.microsoft.com/office/word/2018/wordml" xmlns:w16sdtdh="http://schemas.microsoft.com/office/word/2020/wordml/sdtdatahash" xmlns:w16se="http://schemas.microsoft.com/office/word/2015/wordml/symex" xmlns:w16sdtfl="http://schemas.microsoft.com/office/word/2024/wordml/sdtformatlock" xmlns:w16du="http://schemas.microsoft.com/office/word/2023/wordml/word16du" xmlns:oel="http://schemas.microsoft.com/office/2019/extlst">
                 <w:pict>
                   <v:shapetype w14:anchorId="08E5290B" id="_x0000_t32" coordsize="21600,21600" o:spt="32" o:oned="t" path="m,l21600,21600e" filled="f">
                     <v:path arrowok="t" fillok="f" o:connecttype="none"/>
@@ -6360,7 +6449,7 @@
 </file>
 
 <file path=customXml/itemProps2.xml><?xml version="1.0" encoding="utf-8"?>
-<ds:datastoreItem xmlns:ds="http://schemas.openxmlformats.org/officeDocument/2006/customXml" ds:itemID="{F29FE05D-982E-42FB-AA25-B115710D0118}">
+<ds:datastoreItem xmlns:ds="http://schemas.openxmlformats.org/officeDocument/2006/customXml" ds:itemID="{8E2D8CF5-536D-442E-B8C3-7E36262CAF59}">
   <ds:schemaRefs>
     <ds:schemaRef ds:uri="http://schemas.openxmlformats.org/officeDocument/2006/bibliography"/>
   </ds:schemaRefs>

</xml_diff>

<commit_message>
feat: two separate dates — report_date (top) and date (violation in table)
- Template: replace remnant paragraph with 'תאריך כתיבת הדוח: {{report_date}}'
- Template: {{date}} remains in the table's violation date row
- report.js: add report_date patch = today's date (10pt, top-left)

Co-Authored-By: Claude Sonnet 4.6 <noreply@anthropic.com>
</commit_message>
<xml_diff>
--- a/YNSHOUF_Template.docx
+++ b/YNSHOUF_Template.docx
@@ -4,66 +4,29 @@
   <w:body>
     <w:p>
       <w:pPr>
-        <w:pStyle w:val="Title"/>
-        <w:bidi/>
-        <w:spacing w:before="0"/>
-        <w:jc w:val="right"/>
+        <w:spacing w:after="0"/>
         <w:rPr>
-          <w:rFonts w:asciiTheme="minorBidi" w:hAnsiTheme="minorBidi" w:cstheme="minorBidi" w:hint="cs"/>
-          <w:color w:val="auto"/>
-          <w:sz w:val="24"/>
-          <w:szCs w:val="24"/>
-          <w:u w:val="single"/>
-          <w:rtl/>
+          <w:rFonts w:cs="Arial"/>
+          <w:sz w:val="20"/>
+          <w:szCs w:val="20"/>
+        </w:rPr>
+      </w:pPr>
+      <w:r>
+        <w:rPr>
+          <w:rFonts w:cs="Arial"/>
+          <w:sz w:val="20"/>
+          <w:szCs w:val="20"/>
           <w:lang w:bidi="he-IL"/>
         </w:rPr>
-      </w:pPr>
-      <w:r>
-        <w:rPr>
-          <w:rFonts w:asciiTheme="minorBidi" w:hAnsiTheme="minorBidi" w:cs="Arial"/>
-          <w:color w:val="auto"/>
-          <w:sz w:val="24"/>
-          <w:szCs w:val="24"/>
-          <w:u w:val="single"/>
-          <w:rtl/>
-          <w:lang w:bidi="he-IL"/>
-        </w:rPr>
-        <w:t/>
+        <w:t xml:space="preserve">תאריך כתיבת הדוח: </w:t>
       </w:r>
       <w:r>
         <w:rPr>
-          <w:rFonts w:asciiTheme="minorBidi" w:hAnsiTheme="minorBidi" w:cstheme="minorBidi"/>
-          <w:color w:val="auto"/>
-          <w:sz w:val="24"/>
-          <w:szCs w:val="24"/>
-          <w:u w:val="single"/>
-          <w:lang w:bidi="he-IL"/>
+          <w:rFonts w:cs="Arial"/>
+          <w:sz w:val="20"/>
+          <w:szCs w:val="20"/>
         </w:rPr>
-        <w:t>date</w:t>
-      </w:r>
-      <w:r>
-        <w:rPr>
-          <w:rFonts w:asciiTheme="minorBidi" w:hAnsiTheme="minorBidi" w:cs="Arial"/>
-          <w:color w:val="auto"/>
-          <w:sz w:val="24"/>
-          <w:szCs w:val="24"/>
-          <w:u w:val="single"/>
-          <w:rtl/>
-          <w:lang w:bidi="he-IL"/>
-        </w:rPr>
-        <w:t/>
-      </w:r>
-      <w:r>
-        <w:rPr>
-          <w:rFonts w:asciiTheme="minorBidi" w:hAnsiTheme="minorBidi" w:cstheme="minorBidi" w:hint="cs"/>
-          <w:color w:val="auto"/>
-          <w:sz w:val="24"/>
-          <w:szCs w:val="24"/>
-          <w:u w:val="single"/>
-          <w:rtl/>
-          <w:lang w:bidi="he-IL"/>
-        </w:rPr>
-        <w:t xml:space="preserve">                                                          </w:t>
+        <w:t>{{report_date}}</w:t>
       </w:r>
     </w:p>
     <w:p>

</xml_diff>

<commit_message>
Fix duplicate date row in template, add label to report_date patch, bump SW to v11
- Remove duplicate empty תאריך row from YNSHOUF_Template.docx (leftover from bak2+bak3 scripts)
- Include 'תאריך כתיבת הדוח:' label in report_date patch (PatchType.PARAGRAPH wipes surrounding text)
- Bump SW cache to ynshouf-v11 to invalidate v10 cache and serve updated files

Co-Authored-By: Claude Sonnet 4.6 <noreply@anthropic.com>
</commit_message>
<xml_diff>
--- a/YNSHOUF_Template.docx
+++ b/YNSHOUF_Template.docx
@@ -444,62 +444,6 @@
             </w:pPr>
             <w:r>
               <w:t>{{inspector_num}}</w:t>
-            </w:r>
-          </w:p>
-        </w:tc>
-      </w:tr>
-      <w:tr>
-        <w:trPr>
-          <w:cantSplit/>
-        </w:trPr>
-        <w:tc>
-          <w:tcPr>
-            <w:tcW w:w="4505" w:type="dxa"/>
-            <w:tcBorders>
-              <w:top w:val="single" w:sz="1" w:space="0" w:color="CCCCCC"/>
-              <w:left w:val="single" w:sz="1" w:space="0" w:color="CCCCCC"/>
-              <w:bottom w:val="single" w:sz="1" w:space="0" w:color="CCCCCC"/>
-              <w:right w:val="single" w:sz="1" w:space="0" w:color="CCCCCC"/>
-            </w:tcBorders>
-            <w:tcMar>
-              <w:top w:w="100" w:type="dxa"/>
-              <w:left w:w="100" w:type="dxa"/>
-              <w:bottom w:w="100" w:type="dxa"/>
-              <w:right w:w="100" w:type="dxa"/>
-            </w:tcMar>
-            <w:vAlign w:val="center"/>
-          </w:tcPr>
-          <w:p>
-            <w:pPr>
-              <w:pStyle w:val="TiMiNormal"/>
-              <w:bidi/>
-            </w:pPr>
-            <w:r>
-              <w:rPr>
-                <w:rFonts w:hint="cs"/>
-              </w:rPr>
-              <w:t>תאריך</w:t>
-            </w:r>
-          </w:p>
-        </w:tc>
-        <w:tc>
-          <w:tcPr>
-            <w:tcW w:w="4505" w:type="dxa"/>
-            <w:tcBorders>
-              <w:top w:val="single" w:sz="1" w:space="0" w:color="CCCCCC"/>
-              <w:left w:val="single" w:sz="1" w:space="0" w:color="CCCCCC"/>
-              <w:bottom w:val="single" w:sz="1" w:space="0" w:color="CCCCCC"/>
-              <w:right w:val="single" w:sz="1" w:space="0" w:color="CCCCCC"/>
-            </w:tcBorders>
-            <w:vAlign w:val="center"/>
-          </w:tcPr>
-          <w:p>
-            <w:pPr>
-              <w:pStyle w:val="TiMiNormal"/>
-              <w:bidi/>
-            </w:pPr>
-            <w:r>
-              <w:t/>
             </w:r>
           </w:p>
         </w:tc>

</xml_diff>

<commit_message>
Include latest template binary (date label cell cleared)
Co-Authored-By: Claude Sonnet 4.6 <noreply@anthropic.com>
</commit_message>
<xml_diff>
--- a/YNSHOUF_Template.docx
+++ b/YNSHOUF_Template.docx
@@ -16,17 +16,26 @@
           <w:rFonts w:cs="Arial"/>
           <w:sz w:val="20"/>
           <w:szCs w:val="20"/>
-          <w:lang w:bidi="he-IL"/>
         </w:rPr>
-        <w:t xml:space="preserve">תאריך כתיבת הדוח: </w:t>
+        <w:t>{{</w:t>
       </w:r>
+      <w:proofErr w:type="spellStart"/>
       <w:r>
         <w:rPr>
           <w:rFonts w:cs="Arial"/>
           <w:sz w:val="20"/>
           <w:szCs w:val="20"/>
         </w:rPr>
-        <w:t>{{report_date}}</w:t>
+        <w:t>report_date</w:t>
+      </w:r>
+      <w:proofErr w:type="spellEnd"/>
+      <w:r>
+        <w:rPr>
+          <w:rFonts w:cs="Arial"/>
+          <w:sz w:val="20"/>
+          <w:szCs w:val="20"/>
+        </w:rPr>
+        <w:t>}}</w:t>
       </w:r>
     </w:p>
     <w:p>
@@ -195,7 +204,7 @@
         <w:bidi/>
         <w:spacing w:before="100" w:beforeAutospacing="1" w:after="100" w:afterAutospacing="1" w:line="360" w:lineRule="auto"/>
         <w:rPr>
-          <w:rFonts w:asciiTheme="minorBidi" w:eastAsia="Times New Roman" w:hAnsiTheme="minorBidi" w:hint="cs"/>
+          <w:rFonts w:asciiTheme="minorBidi" w:eastAsia="Times New Roman" w:hAnsiTheme="minorBidi"/>
           <w:color w:val="1F497D" w:themeColor="text2"/>
           <w:rtl/>
           <w:lang w:bidi="he-IL"/>
@@ -241,8 +250,6 @@
         </w:rPr>
         <w:t>:</w:t>
       </w:r>
-      <w:bookmarkStart w:id="0" w:name="_GoBack"/>
-      <w:bookmarkEnd w:id="0"/>
     </w:p>
     <w:p>
       <w:pPr>
@@ -414,10 +421,8 @@
             <w:pPr>
               <w:pStyle w:val="TiMiNormal"/>
               <w:bidi/>
-              <w:rPr>
-                <w:rFonts w:hint="cs"/>
-              </w:rPr>
             </w:pPr>
+            <w:bookmarkStart w:id="0" w:name="_GoBack"/>
             <w:r>
               <w:rPr>
                 <w:rFonts w:hint="cs"/>
@@ -448,6 +453,7 @@
           </w:p>
         </w:tc>
       </w:tr>
+      <w:bookmarkEnd w:id="0"/>
       <w:tr>
         <w:trPr>
           <w:cantSplit/>
@@ -478,7 +484,7 @@
               <w:rPr>
                 <w:rFonts w:hint="cs"/>
               </w:rPr>
-              <w:t/>
+              <w:t>תאריך</w:t>
             </w:r>
           </w:p>
         </w:tc>
@@ -529,6 +535,9 @@
             <w:pPr>
               <w:pStyle w:val="TiMiNormal"/>
               <w:bidi/>
+              <w:rPr>
+                <w:rFonts w:hint="cs"/>
+              </w:rPr>
             </w:pPr>
             <w:r>
               <w:t>שעה</w:t>
@@ -2105,7 +2114,7 @@
                   </wp:anchor>
                 </w:drawing>
               </mc:Choice>
-              <mc:Fallback xmlns:cx="http://schemas.microsoft.com/office/drawing/2014/chartex" xmlns:cx1="http://schemas.microsoft.com/office/drawing/2015/9/8/chartex" xmlns:cx2="http://schemas.microsoft.com/office/drawing/2015/10/21/chartex" xmlns:cx3="http://schemas.microsoft.com/office/drawing/2016/5/9/chartex" xmlns:cx4="http://schemas.microsoft.com/office/drawing/2016/5/10/chartex" xmlns:cx5="http://schemas.microsoft.com/office/drawing/2016/5/11/chartex" xmlns:cx6="http://schemas.microsoft.com/office/drawing/2016/5/12/chartex" xmlns:cx7="http://schemas.microsoft.com/office/drawing/2016/5/13/chartex" xmlns:cx8="http://schemas.microsoft.com/office/drawing/2016/5/14/chartex" xmlns:aink="http://schemas.microsoft.com/office/drawing/2016/ink" xmlns:am3d="http://schemas.microsoft.com/office/drawing/2017/model3d" xmlns:w15="http://schemas.microsoft.com/office/word/2012/wordml" xmlns:w16cex="http://schemas.microsoft.com/office/word/2018/wordml/cex" xmlns:w16cid="http://schemas.microsoft.com/office/word/2016/wordml/cid" xmlns:w16="http://schemas.microsoft.com/office/word/2018/wordml" xmlns:w16sdtdh="http://schemas.microsoft.com/office/word/2020/wordml/sdtdatahash" xmlns:w16se="http://schemas.microsoft.com/office/word/2015/wordml/symex" xmlns:w16sdtfl="http://schemas.microsoft.com/office/word/2024/wordml/sdtformatlock" xmlns:w16du="http://schemas.microsoft.com/office/word/2023/wordml/word16du" xmlns:oel="http://schemas.microsoft.com/office/2019/extlst">
+              <mc:Fallback xmlns:oel="http://schemas.microsoft.com/office/2019/extlst" xmlns:w16du="http://schemas.microsoft.com/office/word/2023/wordml/word16du" xmlns:w16sdtfl="http://schemas.microsoft.com/office/word/2024/wordml/sdtformatlock" xmlns:w16se="http://schemas.microsoft.com/office/word/2015/wordml/symex" xmlns:w16sdtdh="http://schemas.microsoft.com/office/word/2020/wordml/sdtdatahash" xmlns:w16="http://schemas.microsoft.com/office/word/2018/wordml" xmlns:w16cid="http://schemas.microsoft.com/office/word/2016/wordml/cid" xmlns:w16cex="http://schemas.microsoft.com/office/word/2018/wordml/cex" xmlns:w15="http://schemas.microsoft.com/office/word/2012/wordml" xmlns:am3d="http://schemas.microsoft.com/office/drawing/2017/model3d" xmlns:aink="http://schemas.microsoft.com/office/drawing/2016/ink" xmlns:cx8="http://schemas.microsoft.com/office/drawing/2016/5/14/chartex" xmlns:cx7="http://schemas.microsoft.com/office/drawing/2016/5/13/chartex" xmlns:cx6="http://schemas.microsoft.com/office/drawing/2016/5/12/chartex" xmlns:cx5="http://schemas.microsoft.com/office/drawing/2016/5/11/chartex" xmlns:cx4="http://schemas.microsoft.com/office/drawing/2016/5/10/chartex" xmlns:cx3="http://schemas.microsoft.com/office/drawing/2016/5/9/chartex" xmlns:cx2="http://schemas.microsoft.com/office/drawing/2015/10/21/chartex" xmlns:cx1="http://schemas.microsoft.com/office/drawing/2015/9/8/chartex" xmlns:cx="http://schemas.microsoft.com/office/drawing/2014/chartex">
                 <w:pict>
                   <v:shapetype w14:anchorId="08E5290B" id="_x0000_t32" coordsize="21600,21600" o:spt="32" o:oned="t" path="m,l21600,21600e" filled="f">
                     <v:path arrowok="t" fillok="f" o:connecttype="none"/>
@@ -6356,7 +6365,7 @@
 </file>
 
 <file path=customXml/itemProps2.xml><?xml version="1.0" encoding="utf-8"?>
-<ds:datastoreItem xmlns:ds="http://schemas.openxmlformats.org/officeDocument/2006/customXml" ds:itemID="{8E2D8CF5-536D-442E-B8C3-7E36262CAF59}">
+<ds:datastoreItem xmlns:ds="http://schemas.openxmlformats.org/officeDocument/2006/customXml" ds:itemID="{338B8920-3E23-43B2-AEFD-468DB927F063}">
   <ds:schemaRefs>
     <ds:schemaRef ds:uri="http://schemas.openxmlformats.org/officeDocument/2006/bibliography"/>
   </ds:schemaRefs>

</xml_diff>